<commit_message>
Detail Peruvian report update in Doc02
</commit_message>
<xml_diff>
--- a/docs/SCW16-Doc02-CPUE_Coordination.docx
+++ b/docs/SCW16-Doc02-CPUE_Coordination.docx
@@ -63,18 +63,18 @@
                 <wp:inline>
                   <wp:extent cx="1234440" cy="1223705"/>
                   <wp:effectExtent b="0" l="0" r="0" t="0"/>
-                  <wp:docPr descr="" title="" id="21" name="Picture"/>
+                  <wp:docPr descr="" title="" id="10" name="Picture"/>
                   <a:graphic>
                     <a:graphicData uri="http://schemas.openxmlformats.org/drawingml/2006/picture">
                       <pic:pic>
                         <pic:nvPicPr>
-                          <pic:cNvPr descr="annex/logo.png" id="22" name="Picture"/>
+                          <pic:cNvPr descr="annex/logo.png" id="11" name="Picture"/>
                           <pic:cNvPicPr>
                             <a:picLocks noChangeArrowheads="1" noChangeAspect="1"/>
                           </pic:cNvPicPr>
                         </pic:nvPicPr>
                         <pic:blipFill>
-                          <a:blip r:embed="rId20"/>
+                          <a:blip r:embed="rId9"/>
                           <a:stretch>
                             <a:fillRect/>
                           </a:stretch>
@@ -139,7 +139,7 @@
           <w:i/>
           <w:iCs/>
         </w:rPr>
-        <w:t xml:space="preserve">SCW16/Paper-02</w:t>
+        <w:t xml:space="preserve">SCW16-Doc02</w:t>
       </w:r>
     </w:p>
     <w:p>
@@ -147,10 +147,10 @@
         <w:pStyle w:val="BodyText"/>
       </w:pPr>
       <w:r>
-        <w:t xml:space="preserve">15 April 2026</w:t>
-      </w:r>
-    </w:p>
-    <w:bookmarkStart w:id="23" w:name="summary"/>
+        <w:t xml:space="preserve">14 May 2026</w:t>
+      </w:r>
+    </w:p>
+    <w:bookmarkStart w:id="12" w:name="summary"/>
     <w:p>
       <w:pPr>
         <w:pStyle w:val="Heading1"/>
@@ -212,10 +212,10 @@
         <w:rPr>
           <w:rStyle w:val="VerbatimChar"/>
         </w:rPr>
-        <w:t xml:space="preserve">SCW16-Paper-03-CPUE_MetaAnalysis.qmd</w:t>
-      </w:r>
-      <w:r>
-        <w:t xml:space="preserve">. Paper 03 is a backward-looking synthesis of CPUE</w:t>
+        <w:t xml:space="preserve">SCW16-Doc03-CPUE_MetaAnalysis.qmd</w:t>
+      </w:r>
+      <w:r>
+        <w:t xml:space="preserve">. Doc03 is a backward-looking synthesis of CPUE</w:t>
       </w:r>
       <w:r>
         <w:t xml:space="preserve"> </w:t>
@@ -227,7 +227,7 @@
         <w:t xml:space="preserve"> </w:t>
       </w:r>
       <w:r>
-        <w:t xml:space="preserve">note for SCW16. The two papers are complementary: Paper 03 provides background and Paper 02</w:t>
+        <w:t xml:space="preserve">note for SCW16. The two papers are complementary: Doc03 provides background and Doc02</w:t>
       </w:r>
       <w:r>
         <w:t xml:space="preserve"> </w:t>
@@ -236,8 +236,70 @@
         <w:t xml:space="preserve">defines the work plan and decision points for the benchmark session.</w:t>
       </w:r>
     </w:p>
-    <w:bookmarkEnd w:id="23"/>
-    <w:bookmarkStart w:id="24" w:name="meeting-details"/>
+    <w:p>
+      <w:pPr>
+        <w:pStyle w:val="BodyText"/>
+      </w:pPr>
+      <w:r>
+        <w:t xml:space="preserve">After the coordination meeting, Ana Alegre notified the organizers that work-related delays had</w:t>
+      </w:r>
+      <w:r>
+        <w:t xml:space="preserve"> </w:t>
+      </w:r>
+      <w:r>
+        <w:t xml:space="preserve">affected delivery of several Peruvian delegation reports. She requested that the report</w:t>
+      </w:r>
+      <w:r>
+        <w:t xml:space="preserve"> </w:t>
+      </w:r>
+      <w:r>
+        <w:rPr>
+          <w:i/>
+          <w:iCs/>
+        </w:rPr>
+        <w:t xml:space="preserve">Standardization of catch-per-unit-effort (CPUE) for jack mackerel (2015-2025) in Peruvian</w:t>
+      </w:r>
+      <w:r>
+        <w:rPr>
+          <w:i/>
+          <w:iCs/>
+        </w:rPr>
+        <w:t xml:space="preserve"> </w:t>
+      </w:r>
+      <w:r>
+        <w:rPr>
+          <w:i/>
+          <w:iCs/>
+        </w:rPr>
+        <w:t xml:space="preserve">national jurisdictional waters</w:t>
+      </w:r>
+      <w:r>
+        <w:t xml:space="preserve"> </w:t>
+      </w:r>
+      <w:r>
+        <w:t xml:space="preserve">(Miran Geronimo and Gersson Roman) be included for presentation</w:t>
+      </w:r>
+      <w:r>
+        <w:t xml:space="preserve"> </w:t>
+      </w:r>
+      <w:r>
+        <w:t xml:space="preserve">and discussion during the Day 2 CPUE session. She also identified related Peruvian reports for</w:t>
+      </w:r>
+      <w:r>
+        <w:t xml:space="preserve"> </w:t>
+      </w:r>
+      <w:r>
+        <w:t xml:space="preserve">the benchmark workshop, including one length-frequency report requested for the Day 3 biological</w:t>
+      </w:r>
+      <w:r>
+        <w:t xml:space="preserve"> </w:t>
+      </w:r>
+      <w:r>
+        <w:t xml:space="preserve">inputs session and two additional reports on length-weight relationships and acoustic-index use.</w:t>
+      </w:r>
+    </w:p>
+    <w:bookmarkEnd w:id="12"/>
+    <w:bookmarkStart w:id="13" w:name="meeting-details"/>
     <w:p>
       <w:pPr>
         <w:pStyle w:val="Heading1"/>
@@ -294,8 +356,8 @@
         <w:t xml:space="preserve">Participants: Criscely Lujan, Miriam Geronimo, Erich Diaz, Ignacio Payá, José Zenteno, Sebastián Vásquez, and Niels Hintzen</w:t>
       </w:r>
     </w:p>
-    <w:bookmarkEnd w:id="24"/>
-    <w:bookmarkStart w:id="25" w:name="benchmark-rationale"/>
+    <w:bookmarkEnd w:id="13"/>
+    <w:bookmarkStart w:id="14" w:name="benchmark-rationale"/>
     <w:p>
       <w:pPr>
         <w:pStyle w:val="Heading1"/>
@@ -356,8 +418,8 @@
         <w:t xml:space="preserve">the operating model, and the candidate management procedures.</w:t>
       </w:r>
     </w:p>
-    <w:bookmarkEnd w:id="25"/>
-    <w:bookmarkStart w:id="26" w:name="proposed-scope-for-the-cpue-session"/>
+    <w:bookmarkEnd w:id="14"/>
+    <w:bookmarkStart w:id="15" w:name="proposed-scope-for-the-cpue-session"/>
     <w:p>
       <w:pPr>
         <w:pStyle w:val="Heading1"/>
@@ -458,8 +520,8 @@
         <w:t xml:space="preserve">recommend which indices are most suitable for operating-model conditioning and which, if any, should be treated as management-procedure input series.</w:t>
       </w:r>
     </w:p>
-    <w:bookmarkEnd w:id="26"/>
-    <w:bookmarkStart w:id="27" w:name="proposed-day-2-session-structure"/>
+    <w:bookmarkEnd w:id="15"/>
+    <w:bookmarkStart w:id="16" w:name="proposed-day-2-session-structure"/>
     <w:p>
       <w:pPr>
         <w:pStyle w:val="Heading1"/>
@@ -488,7 +550,7 @@
         <w:rPr>
           <w:rStyle w:val="VerbatimChar"/>
         </w:rPr>
-        <w:t xml:space="preserve">SCW16-Paper-00.qmd</w:t>
+        <w:t xml:space="preserve">SCW16-Doc00.qmd</w:t>
       </w:r>
       <w:r>
         <w:t xml:space="preserve">.</w:t>
@@ -633,18 +695,34 @@
               <w:pStyle w:val="Compact"/>
             </w:pPr>
             <w:r>
-              <w:t xml:space="preserve">Comparative analysis and parsimony</w:t>
-            </w:r>
-          </w:p>
-        </w:tc>
-        <w:tc>
-          <w:tcPr/>
-          <w:p>
-            <w:pPr>
-              <w:pStyle w:val="Compact"/>
-            </w:pPr>
-            <w:r>
-              <w:t xml:space="preserve">Decide how much model complexity is justified for benchmark index candidates.</w:t>
+              <w:t xml:space="preserve">Peruvian CPUE report</w:t>
+            </w:r>
+          </w:p>
+        </w:tc>
+        <w:tc>
+          <w:tcPr/>
+          <w:p>
+            <w:pPr>
+              <w:pStyle w:val="Compact"/>
+            </w:pPr>
+            <w:r>
+              <w:t xml:space="preserve">Present and discuss</w:t>
+            </w:r>
+            <w:r>
+              <w:t xml:space="preserve"> </w:t>
+            </w:r>
+            <w:r>
+              <w:rPr>
+                <w:i/>
+                <w:iCs/>
+              </w:rPr>
+              <w:t xml:space="preserve">Standardization of catch-per-unit-effort (CPUE) for jack mackerel (2015-2025) in Peruvian national jurisdictional waters</w:t>
+            </w:r>
+            <w:r>
+              <w:t xml:space="preserve"> </w:t>
+            </w:r>
+            <w:r>
+              <w:t xml:space="preserve">(Miran Geronimo and Gersson Roman).</w:t>
             </w:r>
           </w:p>
         </w:tc>
@@ -668,18 +746,18 @@
               <w:pStyle w:val="Compact"/>
             </w:pPr>
             <w:r>
-              <w:t xml:space="preserve">Effort-creep review</w:t>
-            </w:r>
-          </w:p>
-        </w:tc>
-        <w:tc>
-          <w:tcPr/>
-          <w:p>
-            <w:pPr>
-              <w:pStyle w:val="Compact"/>
-            </w:pPr>
-            <w:r>
-              <w:t xml:space="preserve">Reassess current effort-creep assumptions and whether they should be retained or revised.</w:t>
+              <w:t xml:space="preserve">Comparative analysis and parsimony</w:t>
+            </w:r>
+          </w:p>
+        </w:tc>
+        <w:tc>
+          <w:tcPr/>
+          <w:p>
+            <w:pPr>
+              <w:pStyle w:val="Compact"/>
+            </w:pPr>
+            <w:r>
+              <w:t xml:space="preserve">Decide how much model complexity is justified for benchmark index candidates.</w:t>
             </w:r>
           </w:p>
         </w:tc>
@@ -693,6 +771,41 @@
             </w:pPr>
             <w:r>
               <w:t xml:space="preserve">5</w:t>
+            </w:r>
+          </w:p>
+        </w:tc>
+        <w:tc>
+          <w:tcPr/>
+          <w:p>
+            <w:pPr>
+              <w:pStyle w:val="Compact"/>
+            </w:pPr>
+            <w:r>
+              <w:t xml:space="preserve">Effort-creep review</w:t>
+            </w:r>
+          </w:p>
+        </w:tc>
+        <w:tc>
+          <w:tcPr/>
+          <w:p>
+            <w:pPr>
+              <w:pStyle w:val="Compact"/>
+            </w:pPr>
+            <w:r>
+              <w:t xml:space="preserve">Reassess current effort-creep assumptions and whether they should be retained or revised.</w:t>
+            </w:r>
+          </w:p>
+        </w:tc>
+      </w:tr>
+      <w:tr>
+        <w:tc>
+          <w:tcPr/>
+          <w:p>
+            <w:pPr>
+              <w:pStyle w:val="Compact"/>
+            </w:pPr>
+            <w:r>
+              <w:t xml:space="preserve">6</w:t>
             </w:r>
           </w:p>
         </w:tc>
@@ -742,7 +855,7 @@
               <w:pStyle w:val="Compact"/>
             </w:pPr>
             <w:r>
-              <w:t xml:space="preserve">6</w:t>
+              <w:t xml:space="preserve">7</w:t>
             </w:r>
           </w:p>
         </w:tc>
@@ -777,7 +890,7 @@
               <w:pStyle w:val="Compact"/>
             </w:pPr>
             <w:r>
-              <w:t xml:space="preserve">7</w:t>
+              <w:t xml:space="preserve">8</w:t>
             </w:r>
           </w:p>
         </w:tc>
@@ -805,8 +918,8 @@
         </w:tc>
       </w:tr>
     </w:tbl>
-    <w:bookmarkEnd w:id="27"/>
-    <w:bookmarkStart w:id="28" w:name="Xf401d2db3336c20e0fbf6f72668f66b007bbfca"/>
+    <w:bookmarkEnd w:id="16"/>
+    <w:bookmarkStart w:id="17" w:name="Xf401d2db3336c20e0fbf6f72668f66b007bbfca"/>
     <w:p>
       <w:pPr>
         <w:pStyle w:val="Heading1"/>
@@ -922,7 +1035,7 @@
               <w:pStyle w:val="Compact"/>
             </w:pPr>
             <w:r>
-              <w:t xml:space="preserve">Core synthesis paper for the CPUE session; should complement rather than replace Paper 03.</w:t>
+              <w:t xml:space="preserve">Core synthesis paper for the CPUE session; should complement rather than replace Doc03.</w:t>
             </w:r>
           </w:p>
         </w:tc>
@@ -1090,60 +1203,229 @@
               <w:pStyle w:val="Compact"/>
             </w:pPr>
             <w:r>
-              <w:t xml:space="preserve">Update of the Peruvian CPUE index in the ANJ</w:t>
-            </w:r>
-          </w:p>
-        </w:tc>
-        <w:tc>
-          <w:tcPr/>
-          <w:p>
-            <w:pPr>
-              <w:pStyle w:val="Compact"/>
-            </w:pPr>
-            <w:r>
-              <w:t xml:space="preserve">Miriam Geronimo and Criscely Lujan</w:t>
-            </w:r>
-          </w:p>
-        </w:tc>
-        <w:tc>
-          <w:tcPr/>
-          <w:p>
-            <w:pPr>
-              <w:pStyle w:val="Compact"/>
-            </w:pPr>
-            <w:r>
-              <w:t xml:space="preserve">Review industrial and artisanal data, new trip-level analyses, and possible GLM, GAM, or</w:t>
-            </w:r>
-            <w:r>
-              <w:t xml:space="preserve"> </w:t>
-            </w:r>
-            <w:r>
-              <w:rPr>
-                <w:rStyle w:val="VerbatimChar"/>
-              </w:rPr>
-              <w:t xml:space="preserve">sdmTMB</w:t>
-            </w:r>
-            <w:r>
-              <w:t xml:space="preserve"> </w:t>
-            </w:r>
-            <w:r>
-              <w:t xml:space="preserve">updates.</w:t>
+              <w:t xml:space="preserve">Standardization of catch-per-unit-effort (CPUE) for jack mackerel (2015-2025) in Peruvian national jurisdictional waters</w:t>
+            </w:r>
+          </w:p>
+        </w:tc>
+        <w:tc>
+          <w:tcPr/>
+          <w:p>
+            <w:pPr>
+              <w:pStyle w:val="Compact"/>
+            </w:pPr>
+            <w:r>
+              <w:t xml:space="preserve">Miran Geronimo and Gersson Roman</w:t>
+            </w:r>
+          </w:p>
+        </w:tc>
+        <w:tc>
+          <w:tcPr/>
+          <w:p>
+            <w:pPr>
+              <w:pStyle w:val="Compact"/>
+            </w:pPr>
+            <w:r>
+              <w:t xml:space="preserve">Peruvian delegation report requested by Ana Alegre for presentation and discussion during the Day 2 CPUE session. Review national-jurisdiction CPUE standardization, industrial and artisanal data where available, and implications for benchmark index selection.</w:t>
             </w:r>
           </w:p>
         </w:tc>
       </w:tr>
     </w:tbl>
-    <w:bookmarkEnd w:id="28"/>
-    <w:bookmarkStart w:id="35" w:name="main-technical-issues-identified"/>
+    <w:bookmarkEnd w:id="17"/>
+    <w:bookmarkStart w:id="18" w:name="subsequent-peruvian-report-update"/>
     <w:p>
       <w:pPr>
         <w:pStyle w:val="Heading1"/>
       </w:pPr>
       <w:r>
+        <w:t xml:space="preserve">Subsequent Peruvian Report Update</w:t>
+      </w:r>
+    </w:p>
+    <w:p>
+      <w:pPr>
+        <w:pStyle w:val="FirstParagraph"/>
+      </w:pPr>
+      <w:r>
+        <w:t xml:space="preserve">On 14 May 2026, Ana Alegre notified the organizers that work-related delays had affected</w:t>
+      </w:r>
+      <w:r>
+        <w:t xml:space="preserve"> </w:t>
+      </w:r>
+      <w:r>
+        <w:t xml:space="preserve">delivery of several Peruvian delegation reports planned for the benchmark workshop. The CPUE</w:t>
+      </w:r>
+      <w:r>
+        <w:t xml:space="preserve"> </w:t>
+      </w:r>
+      <w:r>
+        <w:t xml:space="preserve">session should explicitly reserve time for the Peruvian CPUE standardization report listed above.</w:t>
+      </w:r>
+      <w:r>
+        <w:t xml:space="preserve"> </w:t>
+      </w:r>
+      <w:r>
+        <w:t xml:space="preserve">This report is the CPUE-session item most directly linked to Doc02.</w:t>
+      </w:r>
+    </w:p>
+    <w:p>
+      <w:pPr>
+        <w:pStyle w:val="BodyText"/>
+      </w:pPr>
+      <w:r>
+        <w:t xml:space="preserve">Ana also identified the following related Peruvian reports:</w:t>
+      </w:r>
+    </w:p>
+    <w:p>
+      <w:pPr>
+        <w:pStyle w:val="Compact"/>
+        <w:numPr>
+          <w:ilvl w:val="0"/>
+          <w:numId w:val="1003"/>
+        </w:numPr>
+      </w:pPr>
+      <w:r>
+        <w:rPr>
+          <w:i/>
+          <w:iCs/>
+        </w:rPr>
+        <w:t xml:space="preserve">Technical report on the updated length-frequency data of the Peruvian jack mackerel</w:t>
+      </w:r>
+      <w:r>
+        <w:rPr>
+          <w:i/>
+          <w:iCs/>
+        </w:rPr>
+        <w:t xml:space="preserve"> </w:t>
+      </w:r>
+      <w:r>
+        <w:rPr>
+          <w:i/>
+          <w:iCs/>
+        </w:rPr>
+        <w:t xml:space="preserve">(Trachurus murphyi) stock in national jurisdictional waters</w:t>
+      </w:r>
+      <w:r>
+        <w:t xml:space="preserve"> </w:t>
+      </w:r>
+      <w:r>
+        <w:t xml:space="preserve">(Criscely Luján and Gersson</w:t>
+      </w:r>
+      <w:r>
+        <w:t xml:space="preserve"> </w:t>
+      </w:r>
+      <w:r>
+        <w:t xml:space="preserve">Roman). This report was requested for presentation and discussion during the Day 3 biological</w:t>
+      </w:r>
+      <w:r>
+        <w:t xml:space="preserve"> </w:t>
+      </w:r>
+      <w:r>
+        <w:t xml:space="preserve">inputs session.</w:t>
+      </w:r>
+    </w:p>
+    <w:p>
+      <w:pPr>
+        <w:pStyle w:val="Compact"/>
+        <w:numPr>
+          <w:ilvl w:val="0"/>
+          <w:numId w:val="1003"/>
+        </w:numPr>
+      </w:pPr>
+      <w:r>
+        <w:rPr>
+          <w:i/>
+          <w:iCs/>
+        </w:rPr>
+        <w:t xml:space="preserve">Length-weight relationship of jack mackerel (Trachurus murphyi) in Peru and its implications</w:t>
+      </w:r>
+      <w:r>
+        <w:rPr>
+          <w:i/>
+          <w:iCs/>
+        </w:rPr>
+        <w:t xml:space="preserve"> </w:t>
+      </w:r>
+      <w:r>
+        <w:rPr>
+          <w:i/>
+          <w:iCs/>
+        </w:rPr>
+        <w:t xml:space="preserve">for biomass estimation</w:t>
+      </w:r>
+      <w:r>
+        <w:t xml:space="preserve"> </w:t>
+      </w:r>
+      <w:r>
+        <w:t xml:space="preserve">(Sandra Cahuin, Ana Alegre and Marilú Bouchon).</w:t>
+      </w:r>
+    </w:p>
+    <w:p>
+      <w:pPr>
+        <w:pStyle w:val="Compact"/>
+        <w:numPr>
+          <w:ilvl w:val="0"/>
+          <w:numId w:val="1003"/>
+        </w:numPr>
+      </w:pPr>
+      <w:r>
+        <w:rPr>
+          <w:i/>
+          <w:iCs/>
+        </w:rPr>
+        <w:t xml:space="preserve">Considerations on the use of the jack mackerel acoustic index in Peruvian national</w:t>
+      </w:r>
+      <w:r>
+        <w:rPr>
+          <w:i/>
+          <w:iCs/>
+        </w:rPr>
+        <w:t xml:space="preserve"> </w:t>
+      </w:r>
+      <w:r>
+        <w:rPr>
+          <w:i/>
+          <w:iCs/>
+        </w:rPr>
+        <w:t xml:space="preserve">jurisdictional waters</w:t>
+      </w:r>
+      <w:r>
+        <w:t xml:space="preserve"> </w:t>
+      </w:r>
+      <w:r>
+        <w:t xml:space="preserve">(Gersson Roman, Sandra Cahuin and Marilú Bouchon).</w:t>
+      </w:r>
+    </w:p>
+    <w:p>
+      <w:pPr>
+        <w:pStyle w:val="FirstParagraph"/>
+      </w:pPr>
+      <w:r>
+        <w:t xml:space="preserve">Although the latter three reports are not CPUE working papers, they affect the broader benchmark</w:t>
+      </w:r>
+      <w:r>
+        <w:t xml:space="preserve"> </w:t>
+      </w:r>
+      <w:r>
+        <w:t xml:space="preserve">agenda and should be cross-referenced when the CPUE session discusses index interpretation,</w:t>
+      </w:r>
+      <w:r>
+        <w:t xml:space="preserve"> </w:t>
+      </w:r>
+      <w:r>
+        <w:t xml:space="preserve">biological inputs, or consistency among abundance indices.</w:t>
+      </w:r>
+    </w:p>
+    <w:bookmarkEnd w:id="18"/>
+    <w:bookmarkStart w:id="25" w:name="main-technical-issues-identified"/>
+    <w:p>
+      <w:pPr>
+        <w:pStyle w:val="Heading1"/>
+      </w:pPr>
+      <w:r>
         <w:t xml:space="preserve">Main Technical Issues Identified</w:t>
       </w:r>
     </w:p>
-    <w:bookmarkStart w:id="29" w:name="comparison-of-modelling-approaches"/>
+    <w:bookmarkStart w:id="19" w:name="comparison-of-modelling-approaches"/>
     <w:p>
       <w:pPr>
         <w:pStyle w:val="Heading2"/>
@@ -1178,8 +1460,8 @@
         <w:t xml:space="preserve">simpler method remains preferable.</w:t>
       </w:r>
     </w:p>
-    <w:bookmarkEnd w:id="29"/>
-    <w:bookmarkStart w:id="30" w:name="X4d961fd257470df2933065f6b359e2287dea819"/>
+    <w:bookmarkEnd w:id="19"/>
+    <w:bookmarkStart w:id="20" w:name="X4d961fd257470df2933065f6b359e2287dea819"/>
     <w:p>
       <w:pPr>
         <w:pStyle w:val="Heading2"/>
@@ -1214,8 +1496,8 @@
         <w:t xml:space="preserve">retained for sensitivity analyses.</w:t>
       </w:r>
     </w:p>
-    <w:bookmarkEnd w:id="30"/>
-    <w:bookmarkStart w:id="31" w:name="X96045968f08655bb57e833e5f59de4d826d2a4b"/>
+    <w:bookmarkEnd w:id="20"/>
+    <w:bookmarkStart w:id="21" w:name="X96045968f08655bb57e833e5f59de4d826d2a4b"/>
     <w:p>
       <w:pPr>
         <w:pStyle w:val="Heading2"/>
@@ -1256,8 +1538,8 @@
         <w:t xml:space="preserve">question rather than a settled issue.</w:t>
       </w:r>
     </w:p>
-    <w:bookmarkEnd w:id="31"/>
-    <w:bookmarkStart w:id="32" w:name="X3a6d109c9926d0d86db347d5db5cf6e4ddf716d"/>
+    <w:bookmarkEnd w:id="21"/>
+    <w:bookmarkStart w:id="22" w:name="X3a6d109c9926d0d86db347d5db5cf6e4ddf716d"/>
     <w:p>
       <w:pPr>
         <w:pStyle w:val="Heading2"/>
@@ -1292,8 +1574,8 @@
         <w:t xml:space="preserve">across countries and fleets.</w:t>
       </w:r>
     </w:p>
-    <w:bookmarkEnd w:id="32"/>
-    <w:bookmarkStart w:id="33" w:name="Xdf05622276576c68fbd988121dc74f4a0f3bf2c"/>
+    <w:bookmarkEnd w:id="22"/>
+    <w:bookmarkStart w:id="23" w:name="Xdf05622276576c68fbd988121dc74f4a0f3bf2c"/>
     <w:p>
       <w:pPr>
         <w:pStyle w:val="Heading2"/>
@@ -1328,8 +1610,8 @@
         <w:t xml:space="preserve">that all indices are directly proportional to total stock biomass at all times.</w:t>
       </w:r>
     </w:p>
-    <w:bookmarkEnd w:id="33"/>
-    <w:bookmarkStart w:id="34" w:name="combined-index-products-for-mse"/>
+    <w:bookmarkEnd w:id="23"/>
+    <w:bookmarkStart w:id="24" w:name="combined-index-products-for-mse"/>
     <w:p>
       <w:pPr>
         <w:pStyle w:val="Heading2"/>
@@ -1364,9 +1646,9 @@
         <w:t xml:space="preserve">for candidate management procedures.</w:t>
       </w:r>
     </w:p>
-    <w:bookmarkEnd w:id="34"/>
-    <w:bookmarkEnd w:id="35"/>
-    <w:bookmarkStart w:id="36" w:name="action-items"/>
+    <w:bookmarkEnd w:id="24"/>
+    <w:bookmarkEnd w:id="25"/>
+    <w:bookmarkStart w:id="26" w:name="action-items"/>
     <w:p>
       <w:pPr>
         <w:pStyle w:val="Heading1"/>
@@ -1583,40 +1865,40 @@
               <w:pStyle w:val="Compact"/>
             </w:pPr>
             <w:r>
-              <w:t xml:space="preserve">Prepare the Peruvian CPUE update and clarify lead attribution for artisanal-fleet work</w:t>
-            </w:r>
-          </w:p>
-        </w:tc>
-        <w:tc>
-          <w:tcPr/>
-          <w:p>
-            <w:pPr>
-              <w:pStyle w:val="Compact"/>
-            </w:pPr>
-            <w:r>
-              <w:t xml:space="preserve">Miriam Geronimo and Criscely Lujan</w:t>
-            </w:r>
-          </w:p>
-        </w:tc>
-        <w:tc>
-          <w:tcPr/>
-          <w:p>
-            <w:pPr>
-              <w:pStyle w:val="Compact"/>
-            </w:pPr>
-            <w:r>
-              <w:t xml:space="preserve">Peru subgroup</w:t>
-            </w:r>
-          </w:p>
-        </w:tc>
-        <w:tc>
-          <w:tcPr/>
-          <w:p>
-            <w:pPr>
-              <w:pStyle w:val="Compact"/>
-            </w:pPr>
-            <w:r>
-              <w:t xml:space="preserve">Before 1 May 2026</w:t>
+              <w:t xml:space="preserve">Prepare and schedule the Peruvian CPUE standardization report for the Day 2 CPUE session</w:t>
+            </w:r>
+          </w:p>
+        </w:tc>
+        <w:tc>
+          <w:tcPr/>
+          <w:p>
+            <w:pPr>
+              <w:pStyle w:val="Compact"/>
+            </w:pPr>
+            <w:r>
+              <w:t xml:space="preserve">Miran Geronimo and Gersson Roman</w:t>
+            </w:r>
+          </w:p>
+        </w:tc>
+        <w:tc>
+          <w:tcPr/>
+          <w:p>
+            <w:pPr>
+              <w:pStyle w:val="Compact"/>
+            </w:pPr>
+            <w:r>
+              <w:t xml:space="preserve">Ana Alegre and Peru subgroup</w:t>
+            </w:r>
+          </w:p>
+        </w:tc>
+        <w:tc>
+          <w:tcPr/>
+          <w:p>
+            <w:pPr>
+              <w:pStyle w:val="Compact"/>
+            </w:pPr>
+            <w:r>
+              <w:t xml:space="preserve">Before SCW16</w:t>
             </w:r>
           </w:p>
         </w:tc>
@@ -1629,6 +1911,52 @@
               <w:pStyle w:val="Compact"/>
             </w:pPr>
             <w:r>
+              <w:t xml:space="preserve">Track related Peruvian length-frequency, length-weight, and acoustic-index reports in the benchmark agenda</w:t>
+            </w:r>
+          </w:p>
+        </w:tc>
+        <w:tc>
+          <w:tcPr/>
+          <w:p>
+            <w:pPr>
+              <w:pStyle w:val="Compact"/>
+            </w:pPr>
+            <w:r>
+              <w:t xml:space="preserve">Ana Alegre and Peru subgroup</w:t>
+            </w:r>
+          </w:p>
+        </w:tc>
+        <w:tc>
+          <w:tcPr/>
+          <w:p>
+            <w:pPr>
+              <w:pStyle w:val="Compact"/>
+            </w:pPr>
+            <w:r>
+              <w:t xml:space="preserve">Workshop organizers</w:t>
+            </w:r>
+          </w:p>
+        </w:tc>
+        <w:tc>
+          <w:tcPr/>
+          <w:p>
+            <w:pPr>
+              <w:pStyle w:val="Compact"/>
+            </w:pPr>
+            <w:r>
+              <w:t xml:space="preserve">Before SCW16</w:t>
+            </w:r>
+          </w:p>
+        </w:tc>
+      </w:tr>
+      <w:tr>
+        <w:tc>
+          <w:tcPr/>
+          <w:p>
+            <w:pPr>
+              <w:pStyle w:val="Compact"/>
+            </w:pPr>
+            <w:r>
               <w:t xml:space="preserve">Coordinate workshop-session organization linked to the CPUE agenda</w:t>
             </w:r>
           </w:p>
@@ -1668,14 +1996,14 @@
         </w:tc>
       </w:tr>
     </w:tbl>
-    <w:bookmarkEnd w:id="36"/>
-    <w:bookmarkStart w:id="37" w:name="relationship-to-paper-03"/>
+    <w:bookmarkEnd w:id="26"/>
+    <w:bookmarkStart w:id="27" w:name="relationship-to-doc03"/>
     <w:p>
       <w:pPr>
         <w:pStyle w:val="Heading1"/>
       </w:pPr>
       <w:r>
-        <w:t xml:space="preserve">Relationship to Paper 03</w:t>
+        <w:t xml:space="preserve">Relationship to Doc03</w:t>
       </w:r>
     </w:p>
     <w:p>
@@ -1686,7 +2014,7 @@
         <w:rPr>
           <w:rStyle w:val="VerbatimChar"/>
         </w:rPr>
-        <w:t xml:space="preserve">SCW16-Paper-03-CPUE_MetaAnalysis.qmd</w:t>
+        <w:t xml:space="preserve">SCW16-Doc03-CPUE_MetaAnalysis.qmd</w:t>
       </w:r>
       <w:r>
         <w:t xml:space="preserve"> </w:t>
@@ -1710,7 +2038,7 @@
         <w:t xml:space="preserve"> </w:t>
       </w:r>
       <w:r>
-        <w:t xml:space="preserve">work plan is documented separately in SCW16/Paper-02 rather than expanding Paper 03 into a second,</w:t>
+        <w:t xml:space="preserve">work plan is documented separately in SCW16-Doc02 rather than expanding Doc03 into a second,</w:t>
       </w:r>
       <w:r>
         <w:t xml:space="preserve"> </w:t>
@@ -1719,7 +2047,7 @@
         <w:t xml:space="preserve">different document type.</w:t>
       </w:r>
     </w:p>
-    <w:bookmarkEnd w:id="37"/>
+    <w:bookmarkEnd w:id="27"/>
     <w:sectPr>
       <w:footnotePr>
         <w:numRestart w:val="eachSect"/>
@@ -1942,6 +2270,9 @@
   <w:num w:numId="1002">
     <w:abstractNumId w:val="991"/>
   </w:num>
+  <w:num w:numId="1003">
+    <w:abstractNumId w:val="991"/>
+  </w:num>
 </w:numbering>
 </file>
 
@@ -1950,10 +2281,10 @@
   <w:docDefaults>
     <w:rPrDefault>
       <w:rPr>
-        <w:rFonts w:asciiTheme="minorHAnsi" w:cstheme="minorBidi" w:eastAsiaTheme="minorHAnsi" w:hAnsiTheme="minorHAnsi"/>
+        <w:rFonts w:asciiTheme="minorHAnsi" w:cstheme="minorBidi" w:eastAsiaTheme="minorEastAsia" w:hAnsiTheme="minorHAnsi"/>
         <w:sz w:val="24"/>
         <w:szCs w:val="24"/>
-        <w:lang w:bidi="ar-SA" w:eastAsia="en-US" w:val="en-US"/>
+        <w:lang w:bidi="ar-SA" w:eastAsia="zh-CN" w:val="en-US"/>
       </w:rPr>
     </w:rPrDefault>
     <w:pPrDefault>
@@ -2494,13 +2825,6 @@
       </w:tblCellMar>
     </w:tblPr>
     <w:tblStylePr w:type="firstRow">
-      <w:tblPr>
-        <w:jc w:val="left"/>
-        <w:tblInd w:type="dxa" w:w="0"/>
-      </w:tblPr>
-      <w:trPr>
-        <w:jc w:val="left"/>
-      </w:trPr>
       <w:tcPr>
         <w:tcBorders>
           <w:bottom w:val="single"/>

</xml_diff>